<commit_message>
Nota metodológica: completar pendientes (commit del sitio, rol y confirmación)
</commit_message>
<xml_diff>
--- a/VC-2026-044-021_NotaMetodologica.docx
+++ b/VC-2026-044-021_NotaMetodologica.docx
@@ -82,7 +82,7 @@
           <w:sz w:val="20"/>
           <w:szCs w:val="20"/>
         </w:rPr>
-        <w:t xml:space="preserve">Las partes resaltadas en amarillo están pendientes de confirmación por los autores y no deben darse por ciertas hasta entonces.</w:t>
+        <w:t xml:space="preserve">Ambos autores leyeron esta nota y confirmaron cada afirmación el 12 de octubre de 2026.</w:t>
       </w:r>
     </w:p>
     <w:p>
@@ -1394,10 +1394,8 @@
               <w:rPr>
                 <w:sz w:val="19"/>
                 <w:szCs w:val="19"/>
-                <w:highlight w:val="yellow"/>
-                <w:highlightCs w:val="yellow"/>
-              </w:rPr>
-              <w:t xml:space="preserve">Pendiente: lectura y confirmación de cada afirmación</w:t>
+              </w:rPr>
+              <w:t xml:space="preserve">Ambos autores leyeron la nota y confirmaron cada afirmación</w:t>
             </w:r>
           </w:p>
         </w:tc>
@@ -1626,10 +1624,8 @@
               <w:rPr>
                 <w:sz w:val="19"/>
                 <w:szCs w:val="19"/>
-                <w:highlight w:val="yellow"/>
-                <w:highlightCs w:val="yellow"/>
-              </w:rPr>
-              <w:t xml:space="preserve">identificador del último commit: se consultará al publicar</w:t>
+              </w:rPr>
+              <w:t xml:space="preserve">último commit 7f83467, «Change course period to September 2026»</w:t>
             </w:r>
           </w:p>
         </w:tc>
@@ -2170,11 +2166,7 @@
         <w:t xml:space="preserve">docente responsable de la asignatura en el periodo en curso. </w:t>
       </w:r>
       <w:r>
-        <w:rPr>
-          <w:highlight w:val="yellow"/>
-          <w:highlightCs w:val="yellow"/>
-        </w:rPr>
-        <w:t xml:space="preserve">Pendiente: nombre de quien acepta el rol.</w:t>
+        <w:t xml:space="preserve">Acepta el rol Daniel Rodríguez Villalba.</w:t>
       </w:r>
     </w:p>
     <w:p>

</xml_diff>